<commit_message>
Update profile and ATS resumes
</commit_message>
<xml_diff>
--- a/resume/dist/Touhidul_Alam_Seyam_Full_Stack_Compact_ATS.docx
+++ b/resume/dist/Touhidul_Alam_Seyam_Full_Stack_Compact_ATS.docx
@@ -29,7 +29,7 @@
           <w:color w:val="5B6770"/>
           <w:sz w:val="19"/>
         </w:rPr>
-        <w:t>Full-Stack Developer | Software Engineer | Applied AI</w:t>
+        <w:t>Web, App and Backend Developer | AI Systems</w:t>
       </w:r>
     </w:p>
     <w:p>
@@ -43,7 +43,7 @@
           <w:color w:val="5B6770"/>
           <w:sz w:val="16"/>
         </w:rPr>
-        <w:t>Chattogram, Bangladesh  |  +880 1311-104804  |  seyamalam41@gmail.com  |  seyamalam.vercel.app  |  github.com/Seyamalam  |  orcid.org/0009-0007-7512-1893</w:t>
+        <w:t>Chattogram, Bangladesh  |  +880 1311-104804  |  seyamalam41@gmail.com  |  seyamalam.vercel.app  |  github.com/Seyamalam  |  linkedin.com/in/touhidulalamseyam  |  orcid.org/0009-0007-7512-1893</w:t>
       </w:r>
     </w:p>
     <w:p>
@@ -59,7 +59,7 @@
         <w:rPr>
           <w:rFonts w:ascii="Calibri" w:hAnsi="Calibri"/>
         </w:rPr>
-        <w:t>Software engineer and final-year CSE student building full-stack products, Python/TypeScript developer tools, and applied ML systems. Professional experience since 2021; currently at Hello World Communications Ltd with a publication record spanning applied AI and software systems.</w:t>
+        <w:t>Software engineer and 8th-semester CSE student building web and mobile applications, backend services, Python/TypeScript developer tools, and applied ML systems. Currently at Agentic Institute and Hello World Communications Ltd.</w:t>
       </w:r>
     </w:p>
     <w:p>
@@ -95,6 +95,37 @@
           <w:rFonts w:ascii="Calibri" w:hAnsi="Calibri"/>
           <w:b/>
         </w:rPr>
+        <w:t>Software Engineer | Agentic Institute</w:t>
+      </w:r>
+      <w:r>
+        <w:rPr>
+          <w:rFonts w:ascii="Calibri" w:hAnsi="Calibri"/>
+          <w:color w:val="5B6770"/>
+        </w:rPr>
+        <w:t xml:space="preserve">  |  Remote  |  Dec 2025-Present</w:t>
+      </w:r>
+    </w:p>
+    <w:p>
+      <w:pPr>
+        <w:pStyle w:val="ListBullet"/>
+        <w:keepLines/>
+      </w:pPr>
+      <w:r>
+        <w:rPr>
+          <w:rFonts w:ascii="Calibri" w:hAnsi="Calibri"/>
+        </w:rPr>
+        <w:t>Contribute to application development and AI-enabled, agentic software systems across implementation, integration, testing, and delivery.</w:t>
+      </w:r>
+    </w:p>
+    <w:p>
+      <w:pPr>
+        <w:pStyle w:val="RoleLine"/>
+      </w:pPr>
+      <w:r>
+        <w:rPr>
+          <w:rFonts w:ascii="Calibri" w:hAnsi="Calibri"/>
+          <w:b/>
+        </w:rPr>
         <w:t>Software Engineer | Hello World Communications Ltd</w:t>
       </w:r>
       <w:r>
@@ -102,7 +133,7 @@
           <w:rFonts w:ascii="Calibri" w:hAnsi="Calibri"/>
           <w:color w:val="5B6770"/>
         </w:rPr>
-        <w:t xml:space="preserve">  |  Chattogram  |  Aug 2024–Present</w:t>
+        <w:t xml:space="preserve">  |  Chattogram  |  Aug 2024-Present</w:t>
       </w:r>
     </w:p>
     <w:p>
@@ -133,7 +164,7 @@
           <w:rFonts w:ascii="Calibri" w:hAnsi="Calibri"/>
           <w:color w:val="5B6770"/>
         </w:rPr>
-        <w:t xml:space="preserve">  |  Remote  |  Mar 2021–2025</w:t>
+        <w:t xml:space="preserve">  |  Remote  |  Mar 2021-2025</w:t>
       </w:r>
     </w:p>
     <w:p>
@@ -145,38 +176,7 @@
         <w:rPr>
           <w:rFonts w:ascii="Calibri" w:hAnsi="Calibri"/>
         </w:rPr>
-        <w:t>Deliver web applications for business, nonprofit, academic, and event use—from requirements and interface work through backend development and deployment.</w:t>
-      </w:r>
-    </w:p>
-    <w:p>
-      <w:pPr>
-        <w:pStyle w:val="RoleLine"/>
-      </w:pPr>
-      <w:r>
-        <w:rPr>
-          <w:rFonts w:ascii="Calibri" w:hAnsi="Calibri"/>
-          <w:b/>
-        </w:rPr>
-        <w:t>Research Assistant | BGC Trust University Bangladesh</w:t>
-      </w:r>
-      <w:r>
-        <w:rPr>
-          <w:rFonts w:ascii="Calibri" w:hAnsi="Calibri"/>
-          <w:color w:val="5B6770"/>
-        </w:rPr>
-        <w:t xml:space="preserve">  |  Chattogram  |  Jul 2023–2025</w:t>
-      </w:r>
-    </w:p>
-    <w:p>
-      <w:pPr>
-        <w:pStyle w:val="ListBullet"/>
-        <w:keepLines/>
-      </w:pPr>
-      <w:r>
-        <w:rPr>
-          <w:rFonts w:ascii="Calibri" w:hAnsi="Calibri"/>
-        </w:rPr>
-        <w:t>Conduct ML experiments, data analysis, implementation, and academic writing across computer vision, healthcare, cybersecurity, LLMs, and clustering.</w:t>
+        <w:t>Deliver web applications for business, nonprofit, academic, and event use - from requirements and interface work through backend development and deployment.</w:t>
       </w:r>
     </w:p>
     <w:p>
@@ -376,7 +376,7 @@
         <w:rPr>
           <w:rFonts w:ascii="Calibri" w:hAnsi="Calibri"/>
         </w:rPr>
-        <w:t>B.Sc. (Hons.) Computer Science and Engineering, BGC Trust University Bangladesh — Expected Dec 2026</w:t>
+        <w:t>B.Sc. (Hons.) Computer Science and Engineering, BGC Trust University Bangladesh - 8th semester; expected Dec 2026</w:t>
       </w:r>
     </w:p>
     <w:p>

</xml_diff>

<commit_message>
Add hackathon case studies and honors
</commit_message>
<xml_diff>
--- a/resume/dist/Touhidul_Alam_Seyam_Full_Stack_Compact_ATS.docx
+++ b/resume/dist/Touhidul_Alam_Seyam_Full_Stack_Compact_ATS.docx
@@ -387,6 +387,58 @@
         <w:t>Ten source-backed research works, including IEEE COMPAS papers, SpringerOpen journal articles, and a 2026 Springer conference chapter. ORCID: 0009-0007-7512-1893</w:t>
       </w:r>
     </w:p>
+    <w:p>
+      <w:pPr>
+        <w:pStyle w:val="Heading1"/>
+      </w:pPr>
+      <w:r>
+        <w:t>LEADERSHIP AND HONORS</w:t>
+      </w:r>
+    </w:p>
+    <w:p>
+      <w:r>
+        <w:rPr>
+          <w:rFonts w:ascii="Calibri" w:hAnsi="Calibri"/>
+        </w:rPr>
+        <w:t>Assistant General Secretary | BGCTUB IT Club | Present - Help lead student technology activities, community programs, and club operations.</w:t>
+      </w:r>
+    </w:p>
+    <w:p>
+      <w:pPr>
+        <w:pStyle w:val="ListBullet"/>
+        <w:keepLines/>
+      </w:pPr>
+      <w:r>
+        <w:rPr>
+          <w:rFonts w:ascii="Calibri" w:hAnsi="Calibri"/>
+        </w:rPr>
+        <w:t>Champion, HackFusion InnoNation National Hackathon (solo Team Huntrix), 2026</w:t>
+      </w:r>
+    </w:p>
+    <w:p>
+      <w:pPr>
+        <w:pStyle w:val="ListBullet"/>
+        <w:keepLines/>
+      </w:pPr>
+      <w:r>
+        <w:rPr>
+          <w:rFonts w:ascii="Calibri" w:hAnsi="Calibri"/>
+        </w:rPr>
+        <w:t>Champion, MicroOps Hackathon at CUET CSE IT Fest (with Abtahee Kabir), 2025</w:t>
+      </w:r>
+    </w:p>
+    <w:p>
+      <w:pPr>
+        <w:pStyle w:val="ListBullet"/>
+        <w:keepLines/>
+      </w:pPr>
+      <w:r>
+        <w:rPr>
+          <w:rFonts w:ascii="Calibri" w:hAnsi="Calibri"/>
+        </w:rPr>
+        <w:t>Winner, RoboFusion 1.0 Techathon, 2026</w:t>
+      </w:r>
+    </w:p>
     <w:sectPr>
       <w:pgSz w:w="12240" w:h="15840"/>
       <w:pgMar w:top="893" w:right="893" w:bottom="893" w:left="893" w:header="504" w:footer="504" w:gutter="0"/>

</xml_diff>

<commit_message>
Redesign ATS resumes and strengthen project selection
</commit_message>
<xml_diff>
--- a/resume/dist/Touhidul_Alam_Seyam_Full_Stack_Compact_ATS.docx
+++ b/resume/dist/Touhidul_Alam_Seyam_Full_Stack_Compact_ATS.docx
@@ -11,15 +11,15 @@
         <w:rPr>
           <w:rFonts w:ascii="Calibri" w:hAnsi="Calibri"/>
           <w:b/>
-          <w:color w:val="315B5B"/>
-          <w:sz w:val="42"/>
+          <w:color w:val="0D7168"/>
+          <w:sz w:val="50"/>
         </w:rPr>
         <w:t>Touhidul Alam Seyam</w:t>
       </w:r>
     </w:p>
     <w:p>
       <w:pPr>
-        <w:spacing w:after="60"/>
+        <w:spacing w:after="80"/>
         <w:jc w:val="left"/>
       </w:pPr>
       <w:r>
@@ -34,8 +34,11 @@
     </w:p>
     <w:p>
       <w:pPr>
-        <w:spacing w:after="120" w:line="240" w:lineRule="auto"/>
+        <w:spacing w:after="140" w:line="240" w:lineRule="auto"/>
         <w:jc w:val="left"/>
+        <w:pBdr>
+          <w:bottom w:val="single" w:sz="8" w:space="4" w:color="0D7168"/>
+        </w:pBdr>
       </w:pPr>
       <w:r>
         <w:rPr>
@@ -49,8 +52,15 @@
     <w:p>
       <w:pPr>
         <w:pStyle w:val="Heading1"/>
+        <w:shd w:fill="0D7168"/>
+        <w:ind w:left="115" w:right="115"/>
       </w:pPr>
       <w:r>
+        <w:rPr>
+          <w:rFonts w:ascii="Calibri" w:hAnsi="Calibri"/>
+          <w:b/>
+          <w:color w:val="FFFFFF"/>
+        </w:rPr>
         <w:t>SUMMARY</w:t>
       </w:r>
     </w:p>
@@ -65,8 +75,54 @@
     <w:p>
       <w:pPr>
         <w:pStyle w:val="Heading1"/>
+        <w:shd w:fill="0D7168"/>
+        <w:ind w:left="115" w:right="115"/>
       </w:pPr>
       <w:r>
+        <w:rPr>
+          <w:rFonts w:ascii="Calibri" w:hAnsi="Calibri"/>
+          <w:b/>
+          <w:color w:val="FFFFFF"/>
+        </w:rPr>
+        <w:t>SELECTED WINS</w:t>
+      </w:r>
+    </w:p>
+    <w:p>
+      <w:pPr>
+        <w:pStyle w:val="ListBullet"/>
+        <w:keepLines/>
+      </w:pPr>
+      <w:r>
+        <w:rPr>
+          <w:rFonts w:ascii="Calibri" w:hAnsi="Calibri"/>
+        </w:rPr>
+        <w:t>Champion, HackFusion InnoNation National Hackathon (solo Team Huntrix), 2026</w:t>
+      </w:r>
+    </w:p>
+    <w:p>
+      <w:pPr>
+        <w:pStyle w:val="ListBullet"/>
+        <w:keepLines/>
+      </w:pPr>
+      <w:r>
+        <w:rPr>
+          <w:rFonts w:ascii="Calibri" w:hAnsi="Calibri"/>
+        </w:rPr>
+        <w:t>Champion, MicroOps Hackathon at CUET CSE IT Fest (with Abtahee Kabir), 2025</w:t>
+      </w:r>
+    </w:p>
+    <w:p>
+      <w:pPr>
+        <w:pStyle w:val="Heading1"/>
+        <w:shd w:fill="0D7168"/>
+        <w:ind w:left="115" w:right="115"/>
+      </w:pPr>
+      <w:r>
+        <w:rPr>
+          <w:rFonts w:ascii="Calibri" w:hAnsi="Calibri"/>
+          <w:b/>
+          <w:color w:val="FFFFFF"/>
+        </w:rPr>
         <w:t>CORE SKILLS</w:t>
       </w:r>
     </w:p>
@@ -81,8 +137,15 @@
     <w:p>
       <w:pPr>
         <w:pStyle w:val="Heading1"/>
+        <w:shd w:fill="0D7168"/>
+        <w:ind w:left="115" w:right="115"/>
       </w:pPr>
       <w:r>
+        <w:rPr>
+          <w:rFonts w:ascii="Calibri" w:hAnsi="Calibri"/>
+          <w:b/>
+          <w:color w:val="FFFFFF"/>
+        </w:rPr>
         <w:t>EXPERIENCE</w:t>
       </w:r>
     </w:p>
@@ -182,8 +245,15 @@
     <w:p>
       <w:pPr>
         <w:pStyle w:val="Heading1"/>
+        <w:shd w:fill="0D7168"/>
+        <w:ind w:left="115" w:right="115"/>
       </w:pPr>
       <w:r>
+        <w:rPr>
+          <w:rFonts w:ascii="Calibri" w:hAnsi="Calibri"/>
+          <w:b/>
+          <w:color w:val="FFFFFF"/>
+        </w:rPr>
         <w:t>SELECTED PROJECTS</w:t>
       </w:r>
     </w:p>
@@ -196,14 +266,14 @@
           <w:rFonts w:ascii="Calibri" w:hAnsi="Calibri"/>
           <w:b/>
         </w:rPr>
-        <w:t>bun-scikit</w:t>
+        <w:t>Paris Summit Platform</w:t>
       </w:r>
       <w:r>
         <w:rPr>
           <w:rFonts w:ascii="Calibri" w:hAnsi="Calibri"/>
           <w:color w:val="5B6770"/>
         </w:rPr>
-        <w:t xml:space="preserve"> | TypeScript, Bun, Zig</w:t>
+        <w:t xml:space="preserve"> | Next.js, Convex, Better Auth</w:t>
       </w:r>
       <w:r>
         <w:t xml:space="preserve"> | </w:t>
@@ -211,11 +281,11 @@
       <w:hyperlink r:id="rId9">
         <w:r>
           <w:rPr>
-            <w:color w:val="315B5B"/>
+            <w:color w:val="0D7168"/>
             <w:rFonts w:ascii="Calibri" w:hAnsi="Calibri"/>
-            <w:sz w:val="19"/>
+            <w:sz w:val="18"/>
           </w:rPr>
-          <w:t>github.com/Seyamalam/bun-scikit</w:t>
+          <w:t>github.com/Seyamalam/paris-hindu-summit-2026</w:t>
         </w:r>
       </w:hyperlink>
     </w:p>
@@ -228,7 +298,7 @@
         <w:rPr>
           <w:rFonts w:ascii="Calibri" w:hAnsi="Calibri"/>
         </w:rPr>
-        <w:t>Built a scikit-learn-inspired ML library with native acceleration, CI/benchmark gates, and 209 tracked runtime exports.</w:t>
+        <w:t>Turned ten live design directions into a 19-route client platform with structured editing, protected team access, files, forms, and production delivery workflows.</w:t>
       </w:r>
     </w:p>
     <w:p>
@@ -247,7 +317,7 @@
           <w:rFonts w:ascii="Calibri" w:hAnsi="Calibri"/>
           <w:color w:val="5B6770"/>
         </w:rPr>
-        <w:t xml:space="preserve"> | Next.js, Convex</w:t>
+        <w:t xml:space="preserve"> | Next.js, TypeScript, Convex</w:t>
       </w:r>
       <w:r>
         <w:t xml:space="preserve"> | </w:t>
@@ -255,9 +325,9 @@
       <w:hyperlink r:id="rId10">
         <w:r>
           <w:rPr>
-            <w:color w:val="315B5B"/>
+            <w:color w:val="0D7168"/>
             <w:rFonts w:ascii="Calibri" w:hAnsi="Calibri"/>
-            <w:sz w:val="19"/>
+            <w:sz w:val="18"/>
           </w:rPr>
           <w:t>github.com/Seyamalam/asrro</w:t>
         </w:r>
@@ -272,7 +342,7 @@
         <w:rPr>
           <w:rFonts w:ascii="Calibri" w:hAnsi="Calibri"/>
         </w:rPr>
-        <w:t>Built public pages and role-aware operations for membership, events, attendance, content, reports, notifications, and finance access.</w:t>
+        <w:t>Built public pages and role-aware operations for membership approvals, events, attendance, content, reports, notifications, and restricted finance access.</w:t>
       </w:r>
     </w:p>
     <w:p>
@@ -284,14 +354,14 @@
           <w:rFonts w:ascii="Calibri" w:hAnsi="Calibri"/>
           <w:b/>
         </w:rPr>
-        <w:t>Zodic</w:t>
+        <w:t>CareerPath</w:t>
       </w:r>
       <w:r>
         <w:rPr>
           <w:rFonts w:ascii="Calibri" w:hAnsi="Calibri"/>
           <w:color w:val="5B6770"/>
         </w:rPr>
-        <w:t xml:space="preserve"> | Python, PyPI</w:t>
+        <w:t xml:space="preserve"> | Next.js 16, PostgreSQL, AI SDK</w:t>
       </w:r>
       <w:r>
         <w:t xml:space="preserve"> | </w:t>
@@ -299,11 +369,11 @@
       <w:hyperlink r:id="rId11">
         <w:r>
           <w:rPr>
-            <w:color w:val="315B5B"/>
+            <w:color w:val="0D7168"/>
             <w:rFonts w:ascii="Calibri" w:hAnsi="Calibri"/>
-            <w:sz w:val="19"/>
+            <w:sz w:val="18"/>
           </w:rPr>
-          <w:t>pypi.org/project/zodic/</w:t>
+          <w:t>careerpath-vert.vercel.app</w:t>
         </w:r>
       </w:hyperlink>
     </w:p>
@@ -316,7 +386,7 @@
         <w:rPr>
           <w:rFonts w:ascii="Calibri" w:hAnsi="Calibri"/>
         </w:rPr>
-        <w:t>Published a zero-dependency, Zod-inspired Python validation package with typed parsing and nested errors.</w:t>
+        <w:t>Built profiles, job discovery, explainable match scoring, skill-gap analysis, course recommendations, CV assistance, and generated career roadmaps.</w:t>
       </w:r>
     </w:p>
     <w:p>
@@ -328,14 +398,14 @@
           <w:rFonts w:ascii="Calibri" w:hAnsi="Calibri"/>
           <w:b/>
         </w:rPr>
-        <w:t>ML Competition Pipelines</w:t>
+        <w:t>MicroOps</w:t>
       </w:r>
       <w:r>
         <w:rPr>
           <w:rFonts w:ascii="Calibri" w:hAnsi="Calibri"/>
           <w:color w:val="5B6770"/>
         </w:rPr>
-        <w:t xml:space="preserve"> | Python, LightGBM, XGBoost</w:t>
+        <w:t xml:space="preserve"> | Node.js, Docker, S3, CI/CD</w:t>
       </w:r>
       <w:r>
         <w:t xml:space="preserve"> | </w:t>
@@ -343,11 +413,11 @@
       <w:hyperlink r:id="rId12">
         <w:r>
           <w:rPr>
-            <w:color w:val="315B5B"/>
+            <w:color w:val="0D7168"/>
             <w:rFonts w:ascii="Calibri" w:hAnsi="Calibri"/>
-            <w:sz w:val="19"/>
+            <w:sz w:val="18"/>
           </w:rPr>
-          <w:t>github.com/Seyamalam/playground-series-s6e8</w:t>
+          <w:t>github.com/Seyamalam/cuet-hackathon-1</w:t>
         </w:r>
       </w:hyperlink>
     </w:p>
@@ -360,14 +430,21 @@
         <w:rPr>
           <w:rFonts w:ascii="Calibri" w:hAnsi="Calibri"/>
         </w:rPr>
-        <w:t>Created leakage-safe cross-validation, nested target encoding, schema checks, and rank-blending pipelines.</w:t>
+        <w:t>Co-built the CUET champion around durable background jobs, self-hosted S3-compatible storage, responsive status delivery, and containerized infrastructure.</w:t>
       </w:r>
     </w:p>
     <w:p>
       <w:pPr>
         <w:pStyle w:val="Heading1"/>
+        <w:shd w:fill="0D7168"/>
+        <w:ind w:left="115" w:right="115"/>
       </w:pPr>
       <w:r>
+        <w:rPr>
+          <w:rFonts w:ascii="Calibri" w:hAnsi="Calibri"/>
+          <w:b/>
+          <w:color w:val="FFFFFF"/>
+        </w:rPr>
         <w:t>EDUCATION AND RESEARCH</w:t>
       </w:r>
     </w:p>
@@ -390,9 +467,16 @@
     <w:p>
       <w:pPr>
         <w:pStyle w:val="Heading1"/>
+        <w:shd w:fill="0D7168"/>
+        <w:ind w:left="115" w:right="115"/>
       </w:pPr>
       <w:r>
-        <w:t>LEADERSHIP AND HONORS</w:t>
+        <w:rPr>
+          <w:rFonts w:ascii="Calibri" w:hAnsi="Calibri"/>
+          <w:b/>
+          <w:color w:val="FFFFFF"/>
+        </w:rPr>
+        <w:t>LEADERSHIP AND ADDITIONAL HONORS</w:t>
       </w:r>
     </w:p>
     <w:p>
@@ -412,7 +496,7 @@
         <w:rPr>
           <w:rFonts w:ascii="Calibri" w:hAnsi="Calibri"/>
         </w:rPr>
-        <w:t>Champion, HackFusion InnoNation National Hackathon (solo Team Huntrix), 2026</w:t>
+        <w:t>5th Place, 12th IUT ICT Fest GameJam, 2026; 5th Place, IIUC NextGen Hackathon, 2025</w:t>
       </w:r>
     </w:p>
     <w:p>
@@ -424,24 +508,12 @@
         <w:rPr>
           <w:rFonts w:ascii="Calibri" w:hAnsi="Calibri"/>
         </w:rPr>
-        <w:t>Champion, MicroOps Hackathon at CUET CSE IT Fest (with Abtahee Kabir), 2025</w:t>
-      </w:r>
-    </w:p>
-    <w:p>
-      <w:pPr>
-        <w:pStyle w:val="ListBullet"/>
-        <w:keepLines/>
-      </w:pPr>
-      <w:r>
-        <w:rPr>
-          <w:rFonts w:ascii="Calibri" w:hAnsi="Calibri"/>
-        </w:rPr>
-        <w:t>Winner, RoboFusion 1.0 Techathon, 2026</w:t>
+        <w:t>Finalist, The Infinity AI BuildFest; Best Campus Ambassador, SciBlitz 2.0</w:t>
       </w:r>
     </w:p>
     <w:sectPr>
       <w:pgSz w:w="12240" w:h="15840"/>
-      <w:pgMar w:top="893" w:right="893" w:bottom="893" w:left="893" w:header="504" w:footer="504" w:gutter="0"/>
+      <w:pgMar w:top="792" w:right="792" w:bottom="792" w:left="792" w:header="504" w:footer="504" w:gutter="0"/>
       <w:cols w:space="720"/>
       <w:docGrid w:linePitch="360"/>
     </w:sectPr>
@@ -818,7 +890,7 @@
     <w:rPr>
       <w:rFonts w:ascii="Calibri" w:hAnsi="Calibri"/>
       <w:color w:val="1F2933"/>
-      <w:sz w:val="19"/>
+      <w:sz w:val="18"/>
     </w:rPr>
   </w:style>
   <w:style w:type="paragraph" w:styleId="Header">
@@ -876,14 +948,14 @@
     <w:pPr>
       <w:keepNext/>
       <w:keepLines/>
-      <w:spacing w:before="140" w:after="60"/>
+      <w:spacing w:before="120" w:after="80"/>
       <w:outlineLvl w:val="0"/>
     </w:pPr>
     <w:rPr>
       <w:rFonts w:asciiTheme="majorHAnsi" w:eastAsiaTheme="majorEastAsia" w:hAnsiTheme="majorHAnsi" w:cstheme="majorBidi" w:ascii="Calibri" w:hAnsi="Calibri"/>
       <w:b/>
       <w:bCs/>
-      <w:color w:val="315B5B"/>
+      <w:color w:val="0D7168"/>
       <w:sz w:val="23"/>
       <w:szCs w:val="28"/>
     </w:rPr>
@@ -900,14 +972,14 @@
     <w:pPr>
       <w:keepNext/>
       <w:keepLines/>
-      <w:spacing w:before="140" w:after="60"/>
+      <w:spacing w:before="120" w:after="80"/>
       <w:outlineLvl w:val="1"/>
     </w:pPr>
     <w:rPr>
       <w:rFonts w:asciiTheme="majorHAnsi" w:eastAsiaTheme="majorEastAsia" w:hAnsiTheme="majorHAnsi" w:cstheme="majorBidi" w:ascii="Calibri" w:hAnsi="Calibri"/>
       <w:b/>
       <w:bCs/>
-      <w:color w:val="315B5B"/>
+      <w:color w:val="0D7168"/>
       <w:sz w:val="21"/>
       <w:szCs w:val="26"/>
     </w:rPr>
@@ -1353,7 +1425,7 @@
     </w:pPr>
     <w:rPr>
       <w:rFonts w:ascii="Calibri" w:hAnsi="Calibri"/>
-      <w:sz w:val="19"/>
+      <w:sz w:val="18"/>
     </w:rPr>
   </w:style>
   <w:style w:type="paragraph" w:styleId="ListBullet2">
@@ -12517,7 +12589,7 @@
     </w:pPr>
     <w:rPr>
       <w:rFonts w:ascii="Calibri" w:hAnsi="Calibri"/>
-      <w:sz w:val="19"/>
+      <w:sz w:val="18"/>
     </w:rPr>
   </w:style>
 </w:styles>

</xml_diff>